<commit_message>
feat: implement modular md2docx converter with custom styling and font management
</commit_message>
<xml_diff>
--- a/test_sample_styleA.docx
+++ b/test_sample_styleA.docx
@@ -5,19 +5,25 @@
     <w:p>
       <w:pPr>
         <w:pStyle w:val="Title"/>
+        <w:jc w:val="center"/>
       </w:pPr>
       <w:r>
         <w:rPr>
-          <w:rFonts w:ascii="Arial" w:hAnsi="Arial" w:eastAsia="黑体"/>
-          <w:sz w:val="44"/>
+          <w:rFonts w:ascii="黑体" w:hAnsi="黑体" w:eastAsia="黑体"/>
+          <w:b/>
+          <w:color w:val="000000"/>
+          <w:sz w:val="36"/>
         </w:rPr>
         <w:t>测试文档：MD 转 DOCX 功能验证</w:t>
       </w:r>
     </w:p>
     <w:p>
+      <w:pPr>
+        <w:pStyle w:val="BodyText"/>
+      </w:pPr>
       <w:r>
         <w:rPr>
-          <w:rFonts w:ascii="Times New Roman" w:hAnsi="Times New Roman" w:eastAsia="宋体"/>
+          <w:rFonts w:ascii="仿宋_GB2312" w:hAnsi="仿宋_GB2312" w:eastAsia="仿宋_GB2312"/>
           <w:sz w:val="24"/>
         </w:rPr>
         <w:t>这是一个用于测试 Markdown 转 Word 功能的示例文档。</w:t>
@@ -29,23 +35,27 @@
       </w:pPr>
       <w:r>
         <w:rPr>
-          <w:rFonts w:ascii="Arial" w:hAnsi="Arial" w:eastAsia="黑体"/>
-          <w:sz w:val="36"/>
+          <w:rFonts w:ascii="宋体" w:hAnsi="宋体" w:eastAsia="宋体"/>
+          <w:color w:val="000000"/>
+          <w:sz w:val="32"/>
         </w:rPr>
         <w:t>文本格式测试</w:t>
       </w:r>
     </w:p>
     <w:p>
+      <w:pPr>
+        <w:pStyle w:val="BodyText"/>
+      </w:pPr>
       <w:r>
         <w:rPr>
-          <w:rFonts w:ascii="Times New Roman" w:hAnsi="Times New Roman" w:eastAsia="宋体"/>
+          <w:rFonts w:ascii="仿宋_GB2312" w:hAnsi="仿宋_GB2312" w:eastAsia="仿宋_GB2312"/>
           <w:sz w:val="24"/>
         </w:rPr>
         <w:t>这是一段普通正文，包含</w:t>
       </w:r>
       <w:r>
         <w:rPr>
-          <w:rFonts w:ascii="Times New Roman" w:hAnsi="Times New Roman" w:eastAsia="宋体"/>
+          <w:rFonts w:ascii="仿宋_GB2312" w:hAnsi="仿宋_GB2312" w:eastAsia="仿宋_GB2312"/>
           <w:b/>
           <w:sz w:val="24"/>
         </w:rPr>
@@ -53,14 +63,14 @@
       </w:r>
       <w:r>
         <w:rPr>
-          <w:rFonts w:ascii="Times New Roman" w:hAnsi="Times New Roman" w:eastAsia="宋体"/>
+          <w:rFonts w:ascii="仿宋_GB2312" w:hAnsi="仿宋_GB2312" w:eastAsia="仿宋_GB2312"/>
           <w:sz w:val="24"/>
         </w:rPr>
         <w:t>、</w:t>
       </w:r>
       <w:r>
         <w:rPr>
-          <w:rFonts w:ascii="Times New Roman" w:hAnsi="Times New Roman" w:eastAsia="宋体"/>
+          <w:rFonts w:ascii="仿宋_GB2312" w:hAnsi="仿宋_GB2312" w:eastAsia="仿宋_GB2312"/>
           <w:i/>
           <w:sz w:val="24"/>
         </w:rPr>
@@ -68,7 +78,7 @@
       </w:r>
       <w:r>
         <w:rPr>
-          <w:rFonts w:ascii="Times New Roman" w:hAnsi="Times New Roman" w:eastAsia="宋体"/>
+          <w:rFonts w:ascii="仿宋_GB2312" w:hAnsi="仿宋_GB2312" w:eastAsia="仿宋_GB2312"/>
           <w:sz w:val="24"/>
         </w:rPr>
         <w:t>和</w:t>
@@ -83,16 +93,19 @@
       </w:r>
       <w:r>
         <w:rPr>
-          <w:rFonts w:ascii="Times New Roman" w:hAnsi="Times New Roman" w:eastAsia="宋体"/>
+          <w:rFonts w:ascii="仿宋_GB2312" w:hAnsi="仿宋_GB2312" w:eastAsia="仿宋_GB2312"/>
           <w:sz w:val="24"/>
         </w:rPr>
         <w:t>。</w:t>
       </w:r>
     </w:p>
     <w:p>
+      <w:pPr>
+        <w:pStyle w:val="BodyText"/>
+      </w:pPr>
       <w:r>
         <w:rPr>
-          <w:rFonts w:ascii="Times New Roman" w:hAnsi="Times New Roman" w:eastAsia="宋体"/>
+          <w:rFonts w:ascii="仿宋_GB2312" w:hAnsi="仿宋_GB2312" w:eastAsia="仿宋_GB2312"/>
           <w:sz w:val="24"/>
         </w:rPr>
         <w:t>这是第二段正文，用于测试段落间距。</w:t>
@@ -104,8 +117,9 @@
       </w:pPr>
       <w:r>
         <w:rPr>
-          <w:rFonts w:ascii="Arial" w:hAnsi="Arial" w:eastAsia="黑体"/>
-          <w:sz w:val="36"/>
+          <w:rFonts w:ascii="宋体" w:hAnsi="宋体" w:eastAsia="宋体"/>
+          <w:color w:val="000000"/>
+          <w:sz w:val="32"/>
         </w:rPr>
         <w:t>列表测试</w:t>
       </w:r>
@@ -116,10 +130,106 @@
       </w:pPr>
       <w:r>
         <w:rPr>
-          <w:rFonts w:ascii="Arial" w:hAnsi="Arial" w:eastAsia="黑体"/>
-          <w:sz w:val="32"/>
+          <w:rFonts w:ascii="宋体" w:hAnsi="宋体" w:eastAsia="宋体"/>
+          <w:color w:val="000000"/>
+          <w:sz w:val="28"/>
         </w:rPr>
         <w:t>无序列表</w:t>
+      </w:r>
+    </w:p>
+    <w:p>
+      <w:pPr>
+        <w:pStyle w:val="ULParagraph"/>
+      </w:pPr>
+      <w:r>
+        <w:rPr>
+          <w:rFonts w:ascii="仿宋_GB2312" w:hAnsi="仿宋_GB2312" w:eastAsia="仿宋_GB2312"/>
+          <w:sz w:val="24"/>
+        </w:rPr>
+        <w:t xml:space="preserve">• </w:t>
+      </w:r>
+      <w:r>
+        <w:rPr>
+          <w:rFonts w:ascii="仿宋_GB2312" w:hAnsi="仿宋_GB2312" w:eastAsia="仿宋_GB2312"/>
+          <w:sz w:val="24"/>
+        </w:rPr>
+        <w:t>第一项内容</w:t>
+      </w:r>
+    </w:p>
+    <w:p>
+      <w:pPr>
+        <w:pStyle w:val="ULParagraph"/>
+      </w:pPr>
+      <w:r>
+        <w:rPr>
+          <w:rFonts w:ascii="仿宋_GB2312" w:hAnsi="仿宋_GB2312" w:eastAsia="仿宋_GB2312"/>
+          <w:sz w:val="24"/>
+        </w:rPr>
+        <w:t xml:space="preserve">• </w:t>
+      </w:r>
+      <w:r>
+        <w:rPr>
+          <w:rFonts w:ascii="仿宋_GB2312" w:hAnsi="仿宋_GB2312" w:eastAsia="仿宋_GB2312"/>
+          <w:sz w:val="24"/>
+        </w:rPr>
+        <w:t>第二项内容</w:t>
+      </w:r>
+    </w:p>
+    <w:p>
+      <w:pPr>
+        <w:pStyle w:val="ULParagraph"/>
+      </w:pPr>
+      <w:r>
+        <w:rPr>
+          <w:rFonts w:ascii="仿宋_GB2312" w:hAnsi="仿宋_GB2312" w:eastAsia="仿宋_GB2312"/>
+          <w:sz w:val="24"/>
+        </w:rPr>
+        <w:t xml:space="preserve">• </w:t>
+      </w:r>
+      <w:r>
+        <w:rPr>
+          <w:rFonts w:ascii="仿宋_GB2312" w:hAnsi="仿宋_GB2312" w:eastAsia="仿宋_GB2312"/>
+          <w:sz w:val="24"/>
+        </w:rPr>
+        <w:t>第三项内容</w:t>
+      </w:r>
+    </w:p>
+    <w:p>
+      <w:pPr>
+        <w:pStyle w:val="ULParagraph"/>
+      </w:pPr>
+      <w:r>
+        <w:rPr>
+          <w:rFonts w:ascii="仿宋_GB2312" w:hAnsi="仿宋_GB2312" w:eastAsia="仿宋_GB2312"/>
+          <w:sz w:val="24"/>
+        </w:rPr>
+        <w:t xml:space="preserve">• </w:t>
+      </w:r>
+      <w:r>
+        <w:rPr>
+          <w:rFonts w:ascii="仿宋_GB2312" w:hAnsi="仿宋_GB2312" w:eastAsia="仿宋_GB2312"/>
+          <w:sz w:val="24"/>
+        </w:rPr>
+        <w:t>嵌套子项 A</w:t>
+      </w:r>
+    </w:p>
+    <w:p>
+      <w:pPr>
+        <w:pStyle w:val="ULParagraph"/>
+      </w:pPr>
+      <w:r>
+        <w:rPr>
+          <w:rFonts w:ascii="仿宋_GB2312" w:hAnsi="仿宋_GB2312" w:eastAsia="仿宋_GB2312"/>
+          <w:sz w:val="24"/>
+        </w:rPr>
+        <w:t xml:space="preserve">• </w:t>
+      </w:r>
+      <w:r>
+        <w:rPr>
+          <w:rFonts w:ascii="仿宋_GB2312" w:hAnsi="仿宋_GB2312" w:eastAsia="仿宋_GB2312"/>
+          <w:sz w:val="24"/>
+        </w:rPr>
+        <w:t>嵌套子项 B</w:t>
       </w:r>
     </w:p>
     <w:p>
@@ -128,10 +238,68 @@
       </w:pPr>
       <w:r>
         <w:rPr>
-          <w:rFonts w:ascii="Arial" w:hAnsi="Arial" w:eastAsia="黑体"/>
-          <w:sz w:val="32"/>
+          <w:rFonts w:ascii="宋体" w:hAnsi="宋体" w:eastAsia="宋体"/>
+          <w:color w:val="000000"/>
+          <w:sz w:val="28"/>
         </w:rPr>
         <w:t>有序列表</w:t>
+      </w:r>
+    </w:p>
+    <w:p>
+      <w:pPr>
+        <w:pStyle w:val="ListParagraph"/>
+      </w:pPr>
+      <w:r>
+        <w:rPr>
+          <w:rFonts w:ascii="仿宋_GB2312" w:hAnsi="仿宋_GB2312" w:eastAsia="仿宋_GB2312"/>
+          <w:sz w:val="24"/>
+        </w:rPr>
+        <w:t xml:space="preserve">1. </w:t>
+      </w:r>
+      <w:r>
+        <w:rPr>
+          <w:rFonts w:ascii="仿宋_GB2312" w:hAnsi="仿宋_GB2312" w:eastAsia="仿宋_GB2312"/>
+          <w:sz w:val="24"/>
+        </w:rPr>
+        <w:t>步骤一：安装依赖</w:t>
+      </w:r>
+    </w:p>
+    <w:p>
+      <w:pPr>
+        <w:pStyle w:val="ListParagraph"/>
+      </w:pPr>
+      <w:r>
+        <w:rPr>
+          <w:rFonts w:ascii="仿宋_GB2312" w:hAnsi="仿宋_GB2312" w:eastAsia="仿宋_GB2312"/>
+          <w:sz w:val="24"/>
+        </w:rPr>
+        <w:t xml:space="preserve">2. </w:t>
+      </w:r>
+      <w:r>
+        <w:rPr>
+          <w:rFonts w:ascii="仿宋_GB2312" w:hAnsi="仿宋_GB2312" w:eastAsia="仿宋_GB2312"/>
+          <w:sz w:val="24"/>
+        </w:rPr>
+        <w:t>步骤二：配置参数</w:t>
+      </w:r>
+    </w:p>
+    <w:p>
+      <w:pPr>
+        <w:pStyle w:val="ListParagraph"/>
+      </w:pPr>
+      <w:r>
+        <w:rPr>
+          <w:rFonts w:ascii="仿宋_GB2312" w:hAnsi="仿宋_GB2312" w:eastAsia="仿宋_GB2312"/>
+          <w:sz w:val="24"/>
+        </w:rPr>
+        <w:t xml:space="preserve">3. </w:t>
+      </w:r>
+      <w:r>
+        <w:rPr>
+          <w:rFonts w:ascii="仿宋_GB2312" w:hAnsi="仿宋_GB2312" w:eastAsia="仿宋_GB2312"/>
+          <w:sz w:val="24"/>
+        </w:rPr>
+        <w:t>步骤三：启动服务</w:t>
       </w:r>
     </w:p>
     <w:p>
@@ -140,8 +308,9 @@
       </w:pPr>
       <w:r>
         <w:rPr>
-          <w:rFonts w:ascii="Arial" w:hAnsi="Arial" w:eastAsia="黑体"/>
-          <w:sz w:val="36"/>
+          <w:rFonts w:ascii="宋体" w:hAnsi="宋体" w:eastAsia="宋体"/>
+          <w:color w:val="000000"/>
+          <w:sz w:val="32"/>
         </w:rPr>
         <w:t>代码块测试</w:t>
       </w:r>
@@ -175,8 +344,9 @@
       </w:pPr>
       <w:r>
         <w:rPr>
-          <w:rFonts w:ascii="Arial" w:hAnsi="Arial" w:eastAsia="黑体"/>
-          <w:sz w:val="36"/>
+          <w:rFonts w:ascii="宋体" w:hAnsi="宋体" w:eastAsia="宋体"/>
+          <w:color w:val="000000"/>
+          <w:sz w:val="32"/>
         </w:rPr>
         <w:t>表格测试</w:t>
       </w:r>
@@ -336,8 +506,9 @@
       </w:pPr>
       <w:r>
         <w:rPr>
-          <w:rFonts w:ascii="Arial" w:hAnsi="Arial" w:eastAsia="黑体"/>
-          <w:sz w:val="36"/>
+          <w:rFonts w:ascii="宋体" w:hAnsi="宋体" w:eastAsia="宋体"/>
+          <w:color w:val="000000"/>
+          <w:sz w:val="32"/>
         </w:rPr>
         <w:t>引用测试</w:t>
       </w:r>
@@ -352,7 +523,7 @@
       </w:pPr>
       <w:r>
         <w:rPr>
-          <w:rFonts w:ascii="Times New Roman" w:hAnsi="Times New Roman" w:eastAsia="宋体"/>
+          <w:rFonts w:ascii="仿宋_GB2312" w:hAnsi="仿宋_GB2312" w:eastAsia="仿宋_GB2312"/>
           <w:sz w:val="24"/>
         </w:rPr>
         <w:t>这是一段引用文本。</w:t>
@@ -362,7 +533,7 @@
       </w:r>
       <w:r>
         <w:rPr>
-          <w:rFonts w:ascii="Times New Roman" w:hAnsi="Times New Roman" w:eastAsia="宋体"/>
+          <w:rFonts w:ascii="仿宋_GB2312" w:hAnsi="仿宋_GB2312" w:eastAsia="仿宋_GB2312"/>
           <w:sz w:val="24"/>
         </w:rPr>
         <w:t>可以包含多行内容。</w:t>
@@ -374,8 +545,9 @@
       </w:pPr>
       <w:r>
         <w:rPr>
-          <w:rFonts w:ascii="Arial" w:hAnsi="Arial" w:eastAsia="黑体"/>
-          <w:sz w:val="36"/>
+          <w:rFonts w:ascii="宋体" w:hAnsi="宋体" w:eastAsia="宋体"/>
+          <w:color w:val="000000"/>
+          <w:sz w:val="32"/>
         </w:rPr>
         <w:t>分隔线测试</w:t>
       </w:r>
@@ -393,23 +565,27 @@
       </w:pPr>
       <w:r>
         <w:rPr>
-          <w:rFonts w:ascii="Arial" w:hAnsi="Arial" w:eastAsia="黑体"/>
-          <w:sz w:val="36"/>
+          <w:rFonts w:ascii="宋体" w:hAnsi="宋体" w:eastAsia="宋体"/>
+          <w:color w:val="000000"/>
+          <w:sz w:val="32"/>
         </w:rPr>
         <w:t>链接测试</w:t>
       </w:r>
     </w:p>
     <w:p>
+      <w:pPr>
+        <w:pStyle w:val="BodyText"/>
+      </w:pPr>
       <w:r>
         <w:rPr>
-          <w:rFonts w:ascii="Times New Roman" w:hAnsi="Times New Roman" w:eastAsia="宋体"/>
+          <w:rFonts w:ascii="仿宋_GB2312" w:hAnsi="仿宋_GB2312" w:eastAsia="仿宋_GB2312"/>
           <w:sz w:val="24"/>
         </w:rPr>
         <w:t xml:space="preserve">这是一个 </w:t>
       </w:r>
       <w:r>
         <w:rPr>
-          <w:rFonts w:ascii="Times New Roman" w:hAnsi="Times New Roman" w:eastAsia="宋体"/>
+          <w:rFonts w:ascii="仿宋_GB2312" w:hAnsi="仿宋_GB2312" w:eastAsia="仿宋_GB2312"/>
           <w:color w:val="0563C1"/>
           <w:sz w:val="24"/>
           <w:u w:val="single"/>
@@ -418,7 +594,7 @@
       </w:r>
       <w:r>
         <w:rPr>
-          <w:rFonts w:ascii="Times New Roman" w:hAnsi="Times New Roman" w:eastAsia="宋体"/>
+          <w:rFonts w:ascii="仿宋_GB2312" w:hAnsi="仿宋_GB2312" w:eastAsia="仿宋_GB2312"/>
           <w:sz w:val="24"/>
         </w:rPr>
         <w:t xml:space="preserve"> 。</w:t>
@@ -430,8 +606,9 @@
       </w:pPr>
       <w:r>
         <w:rPr>
-          <w:rFonts w:ascii="Arial" w:hAnsi="Arial" w:eastAsia="黑体"/>
-          <w:sz w:val="36"/>
+          <w:rFonts w:ascii="宋体" w:hAnsi="宋体" w:eastAsia="宋体"/>
+          <w:color w:val="000000"/>
+          <w:sz w:val="32"/>
         </w:rPr>
         <w:t>四级标题测试</w:t>
       </w:r>
@@ -442,22 +619,27 @@
       </w:pPr>
       <w:r>
         <w:rPr>
-          <w:rFonts w:ascii="Arial" w:hAnsi="Arial" w:eastAsia="黑体"/>
-          <w:sz w:val="28"/>
+          <w:rFonts w:ascii="宋体" w:hAnsi="宋体" w:eastAsia="宋体"/>
+          <w:color w:val="000000"/>
+          <w:sz w:val="24"/>
         </w:rPr>
         <w:t>这是四级标题</w:t>
       </w:r>
     </w:p>
     <w:p>
+      <w:pPr>
+        <w:pStyle w:val="BodyText"/>
+      </w:pPr>
       <w:r>
         <w:rPr>
-          <w:rFonts w:ascii="Times New Roman" w:hAnsi="Times New Roman" w:eastAsia="宋体"/>
+          <w:rFonts w:ascii="仿宋_GB2312" w:hAnsi="仿宋_GB2312" w:eastAsia="仿宋_GB2312"/>
           <w:sz w:val="24"/>
         </w:rPr>
         <w:t>正文内容。</w:t>
       </w:r>
     </w:p>
     <w:sectPr>
+      <w:footerReference w:type="default" r:id="rId9"/>
       <w:pgSz w:w="12240" w:h="15840"/>
       <w:pgMar w:top="1440" w:right="1800" w:bottom="1440" w:left="1800" w:header="720" w:footer="720" w:gutter="0"/>
       <w:cols w:space="720"/>
@@ -465,6 +647,58 @@
     </w:sectPr>
   </w:body>
 </w:document>
+</file>
+
+<file path=word/footer1.xml><?xml version="1.0" encoding="utf-8"?>
+<w:ftr xmlns:m="http://schemas.openxmlformats.org/officeDocument/2006/math" xmlns:mc="http://schemas.openxmlformats.org/markup-compatibility/2006" xmlns:mo="http://schemas.microsoft.com/office/mac/office/2008/main" xmlns:mv="urn:schemas-microsoft-com:mac:vml" xmlns:o="urn:schemas-microsoft-com:office:office" xmlns:r="http://schemas.openxmlformats.org/officeDocument/2006/relationships" xmlns:v="urn:schemas-microsoft-com:vml" xmlns:w10="urn:schemas-microsoft-com:office:word" xmlns:w14="http://schemas.microsoft.com/office/word/2010/wordml" xmlns:w="http://schemas.openxmlformats.org/wordprocessingml/2006/main" xmlns:wne="http://schemas.microsoft.com/office/word/2006/wordml" xmlns:wp14="http://schemas.microsoft.com/office/word/2010/wordprocessingDrawing" xmlns:wp="http://schemas.openxmlformats.org/drawingml/2006/wordprocessingDrawing" xmlns:wpc="http://schemas.microsoft.com/office/word/2010/wordprocessingCanvas" xmlns:wpg="http://schemas.microsoft.com/office/word/2010/wordprocessingGroup" xmlns:wpi="http://schemas.microsoft.com/office/word/2010/wordprocessingInk" xmlns:wps="http://schemas.microsoft.com/office/word/2010/wordprocessingShape" mc:Ignorable="w14 wp14">
+  <w:p>
+    <w:pPr>
+      <w:pStyle w:val="Footer"/>
+      <w:jc w:val="center"/>
+    </w:pPr>
+    <w:r>
+      <w:rPr>
+        <w:rFonts w:ascii="宋体" w:hAnsi="宋体" w:eastAsia="宋体"/>
+        <w:sz w:val="18"/>
+      </w:rPr>
+      <w:t xml:space="preserve">第 </w:t>
+    </w:r>
+    <w:r>
+      <w:rPr>
+        <w:rFonts w:ascii="宋体" w:hAnsi="宋体" w:eastAsia="宋体"/>
+        <w:sz w:val="18"/>
+      </w:rPr>
+      <w:fldChar w:fldCharType="begin"/>
+      <w:instrText xml:space="preserve"> PAGE </w:instrText>
+      <w:fldChar w:fldCharType="separate"/>
+      <w:fldChar w:fldCharType="end"/>
+    </w:r>
+    <w:r>
+      <w:rPr>
+        <w:rFonts w:ascii="宋体" w:hAnsi="宋体" w:eastAsia="宋体"/>
+        <w:sz w:val="18"/>
+      </w:rPr>
+      <w:t xml:space="preserve"> 页 共 </w:t>
+    </w:r>
+    <w:r>
+      <w:rPr>
+        <w:rFonts w:ascii="宋体" w:hAnsi="宋体" w:eastAsia="宋体"/>
+        <w:sz w:val="18"/>
+      </w:rPr>
+      <w:fldChar w:fldCharType="begin"/>
+      <w:instrText xml:space="preserve"> NUMPAGES </w:instrText>
+      <w:fldChar w:fldCharType="separate"/>
+      <w:fldChar w:fldCharType="end"/>
+    </w:r>
+    <w:r>
+      <w:rPr>
+        <w:rFonts w:ascii="宋体" w:hAnsi="宋体" w:eastAsia="宋体"/>
+        <w:sz w:val="18"/>
+      </w:rPr>
+      <w:t xml:space="preserve"> 页</w:t>
+    </w:r>
+  </w:p>
+</w:ftr>
 </file>
 
 <file path=word/numbering.xml><?xml version="1.0" encoding="utf-8"?>
@@ -831,10 +1065,13 @@
     <w:qFormat/>
     <w:rsid w:val="00FC693F"/>
     <w:pPr>
-      <w:spacing w:line="360" w:lineRule="auto" w:before="120" w:after="120"/>
+      <w:spacing w:line="240" w:lineRule="auto" w:before="0" w:after="0"/>
+      <w:jc w:val="both"/>
+      <w:snapToGrid w:val="0"/>
+      <w:adjustRightInd w:val="0"/>
     </w:pPr>
     <w:rPr>
-      <w:rFonts w:ascii="Times New Roman" w:hAnsi="Times New Roman" w:eastAsia="宋体"/>
+      <w:rFonts w:ascii="仿宋_GB2312" w:hAnsi="仿宋_GB2312" w:eastAsia="仿宋_GB2312"/>
       <w:sz w:val="24"/>
     </w:rPr>
   </w:style>
@@ -851,6 +1088,8 @@
         <w:tab w:val="right" w:pos="9360"/>
       </w:tabs>
       <w:spacing w:after="0" w:line="240" w:lineRule="auto"/>
+      <w:snapToGrid w:val="0"/>
+      <w:adjustRightInd w:val="0"/>
     </w:pPr>
   </w:style>
   <w:style w:type="character" w:customStyle="1" w:styleId="HeaderChar">
@@ -873,6 +1112,8 @@
         <w:tab w:val="right" w:pos="9360"/>
       </w:tabs>
       <w:spacing w:after="0" w:line="240" w:lineRule="auto"/>
+      <w:snapToGrid w:val="0"/>
+      <w:adjustRightInd w:val="0"/>
     </w:pPr>
   </w:style>
   <w:style w:type="character" w:customStyle="1" w:styleId="FooterChar">
@@ -893,14 +1134,16 @@
     <w:pPr>
       <w:keepNext/>
       <w:keepLines/>
-      <w:spacing w:before="480" w:after="0"/>
+      <w:spacing w:line="240" w:lineRule="auto" w:beforeLines="100" w:afterLines="50"/>
       <w:outlineLvl w:val="0"/>
+      <w:snapToGrid w:val="0"/>
+      <w:adjustRightInd w:val="0"/>
     </w:pPr>
     <w:rPr>
-      <w:rFonts w:asciiTheme="majorHAnsi" w:eastAsiaTheme="majorEastAsia" w:hAnsiTheme="majorHAnsi" w:cstheme="majorBidi"/>
+      <w:rFonts w:asciiTheme="majorHAnsi" w:eastAsiaTheme="majorEastAsia" w:hAnsiTheme="majorHAnsi" w:cstheme="majorBidi" w:ascii="宋体" w:hAnsi="宋体" w:eastAsia="宋体"/>
       <w:b/>
       <w:bCs/>
-      <w:color w:val="365F91" w:themeColor="accent1" w:themeShade="BF"/>
+      <w:color w:val="000000"/>
       <w:sz w:val="28"/>
       <w:szCs w:val="28"/>
     </w:rPr>
@@ -917,14 +1160,16 @@
     <w:pPr>
       <w:keepNext/>
       <w:keepLines/>
-      <w:spacing w:before="200" w:after="0"/>
+      <w:spacing w:line="240" w:lineRule="auto" w:beforeLines="100" w:afterLines="50"/>
       <w:outlineLvl w:val="1"/>
+      <w:snapToGrid w:val="0"/>
+      <w:adjustRightInd w:val="0"/>
     </w:pPr>
     <w:rPr>
-      <w:rFonts w:asciiTheme="majorHAnsi" w:eastAsiaTheme="majorEastAsia" w:hAnsiTheme="majorHAnsi" w:cstheme="majorBidi"/>
+      <w:rFonts w:asciiTheme="majorHAnsi" w:eastAsiaTheme="majorEastAsia" w:hAnsiTheme="majorHAnsi" w:cstheme="majorBidi" w:ascii="宋体" w:hAnsi="宋体" w:eastAsia="宋体"/>
       <w:b/>
       <w:bCs/>
-      <w:color w:val="4F81BD" w:themeColor="accent1"/>
+      <w:color w:val="000000"/>
       <w:sz w:val="26"/>
       <w:szCs w:val="26"/>
     </w:rPr>
@@ -941,14 +1186,16 @@
     <w:pPr>
       <w:keepNext/>
       <w:keepLines/>
-      <w:spacing w:before="200" w:after="0"/>
+      <w:spacing w:line="240" w:lineRule="auto" w:beforeLines="100" w:afterLines="50"/>
       <w:outlineLvl w:val="2"/>
+      <w:snapToGrid w:val="0"/>
+      <w:adjustRightInd w:val="0"/>
     </w:pPr>
     <w:rPr>
-      <w:rFonts w:asciiTheme="majorHAnsi" w:eastAsiaTheme="majorEastAsia" w:hAnsiTheme="majorHAnsi" w:cstheme="majorBidi"/>
+      <w:rFonts w:asciiTheme="majorHAnsi" w:eastAsiaTheme="majorEastAsia" w:hAnsiTheme="majorHAnsi" w:cstheme="majorBidi" w:ascii="宋体" w:hAnsi="宋体" w:eastAsia="宋体"/>
       <w:b/>
       <w:bCs/>
-      <w:color w:val="4F81BD" w:themeColor="accent1"/>
+      <w:color w:val="000000"/>
     </w:rPr>
   </w:style>
   <w:style w:type="paragraph" w:styleId="Heading4">
@@ -964,16 +1211,18 @@
     <w:pPr>
       <w:keepNext/>
       <w:keepLines/>
-      <w:spacing w:before="200" w:after="0"/>
+      <w:spacing w:line="240" w:lineRule="auto" w:beforeLines="100" w:afterLines="50"/>
       <w:outlineLvl w:val="3"/>
+      <w:snapToGrid w:val="0"/>
+      <w:adjustRightInd w:val="0"/>
     </w:pPr>
     <w:rPr>
-      <w:rFonts w:asciiTheme="majorHAnsi" w:eastAsiaTheme="majorEastAsia" w:hAnsiTheme="majorHAnsi" w:cstheme="majorBidi"/>
+      <w:rFonts w:asciiTheme="majorHAnsi" w:eastAsiaTheme="majorEastAsia" w:hAnsiTheme="majorHAnsi" w:cstheme="majorBidi" w:ascii="宋体" w:hAnsi="宋体" w:eastAsia="宋体"/>
       <w:b/>
       <w:bCs/>
       <w:i/>
       <w:iCs/>
-      <w:color w:val="4F81BD" w:themeColor="accent1"/>
+      <w:color w:val="000000"/>
     </w:rPr>
   </w:style>
   <w:style w:type="paragraph" w:styleId="Heading5">
@@ -989,12 +1238,14 @@
     <w:pPr>
       <w:keepNext/>
       <w:keepLines/>
-      <w:spacing w:before="200" w:after="0"/>
+      <w:spacing w:line="240" w:lineRule="auto" w:beforeLines="100" w:afterLines="50"/>
       <w:outlineLvl w:val="4"/>
+      <w:snapToGrid w:val="0"/>
+      <w:adjustRightInd w:val="0"/>
     </w:pPr>
     <w:rPr>
-      <w:rFonts w:asciiTheme="majorHAnsi" w:eastAsiaTheme="majorEastAsia" w:hAnsiTheme="majorHAnsi" w:cstheme="majorBidi"/>
-      <w:color w:val="243F60" w:themeColor="accent1" w:themeShade="7F"/>
+      <w:rFonts w:asciiTheme="majorHAnsi" w:eastAsiaTheme="majorEastAsia" w:hAnsiTheme="majorHAnsi" w:cstheme="majorBidi" w:ascii="宋体" w:hAnsi="宋体" w:eastAsia="宋体"/>
+      <w:color w:val="000000"/>
     </w:rPr>
   </w:style>
   <w:style w:type="paragraph" w:styleId="Heading6">
@@ -1010,14 +1261,16 @@
     <w:pPr>
       <w:keepNext/>
       <w:keepLines/>
-      <w:spacing w:before="200" w:after="0"/>
+      <w:spacing w:line="240" w:lineRule="auto" w:beforeLines="100" w:afterLines="50"/>
       <w:outlineLvl w:val="5"/>
+      <w:snapToGrid w:val="0"/>
+      <w:adjustRightInd w:val="0"/>
     </w:pPr>
     <w:rPr>
-      <w:rFonts w:asciiTheme="majorHAnsi" w:eastAsiaTheme="majorEastAsia" w:hAnsiTheme="majorHAnsi" w:cstheme="majorBidi"/>
+      <w:rFonts w:asciiTheme="majorHAnsi" w:eastAsiaTheme="majorEastAsia" w:hAnsiTheme="majorHAnsi" w:cstheme="majorBidi" w:ascii="宋体" w:hAnsi="宋体" w:eastAsia="宋体"/>
       <w:i/>
       <w:iCs/>
-      <w:color w:val="243F60" w:themeColor="accent1" w:themeShade="7F"/>
+      <w:color w:val="000000"/>
     </w:rPr>
   </w:style>
   <w:style w:type="paragraph" w:styleId="Heading7">
@@ -1033,14 +1286,16 @@
     <w:pPr>
       <w:keepNext/>
       <w:keepLines/>
-      <w:spacing w:before="200" w:after="0"/>
+      <w:spacing w:line="240" w:lineRule="auto" w:beforeLines="100" w:afterLines="50"/>
       <w:outlineLvl w:val="6"/>
+      <w:snapToGrid w:val="0"/>
+      <w:adjustRightInd w:val="0"/>
     </w:pPr>
     <w:rPr>
-      <w:rFonts w:asciiTheme="majorHAnsi" w:eastAsiaTheme="majorEastAsia" w:hAnsiTheme="majorHAnsi" w:cstheme="majorBidi"/>
+      <w:rFonts w:asciiTheme="majorHAnsi" w:eastAsiaTheme="majorEastAsia" w:hAnsiTheme="majorHAnsi" w:cstheme="majorBidi" w:ascii="宋体" w:hAnsi="宋体" w:eastAsia="宋体"/>
       <w:i/>
       <w:iCs/>
-      <w:color w:val="404040" w:themeColor="text1" w:themeTint="BF"/>
+      <w:color w:val="000000"/>
     </w:rPr>
   </w:style>
   <w:style w:type="paragraph" w:styleId="Heading8">
@@ -1056,12 +1311,14 @@
     <w:pPr>
       <w:keepNext/>
       <w:keepLines/>
-      <w:spacing w:before="200" w:after="0"/>
+      <w:spacing w:line="240" w:lineRule="auto" w:beforeLines="100" w:afterLines="50"/>
       <w:outlineLvl w:val="7"/>
+      <w:snapToGrid w:val="0"/>
+      <w:adjustRightInd w:val="0"/>
     </w:pPr>
     <w:rPr>
-      <w:rFonts w:asciiTheme="majorHAnsi" w:eastAsiaTheme="majorEastAsia" w:hAnsiTheme="majorHAnsi" w:cstheme="majorBidi"/>
-      <w:color w:val="4F81BD" w:themeColor="accent1"/>
+      <w:rFonts w:asciiTheme="majorHAnsi" w:eastAsiaTheme="majorEastAsia" w:hAnsiTheme="majorHAnsi" w:cstheme="majorBidi" w:ascii="宋体" w:hAnsi="宋体" w:eastAsia="宋体"/>
+      <w:color w:val="000000"/>
       <w:sz w:val="20"/>
       <w:szCs w:val="20"/>
     </w:rPr>
@@ -1079,14 +1336,16 @@
     <w:pPr>
       <w:keepNext/>
       <w:keepLines/>
-      <w:spacing w:before="200" w:after="0"/>
+      <w:spacing w:line="240" w:lineRule="auto" w:beforeLines="100" w:afterLines="50"/>
       <w:outlineLvl w:val="8"/>
+      <w:snapToGrid w:val="0"/>
+      <w:adjustRightInd w:val="0"/>
     </w:pPr>
     <w:rPr>
-      <w:rFonts w:asciiTheme="majorHAnsi" w:eastAsiaTheme="majorEastAsia" w:hAnsiTheme="majorHAnsi" w:cstheme="majorBidi"/>
+      <w:rFonts w:asciiTheme="majorHAnsi" w:eastAsiaTheme="majorEastAsia" w:hAnsiTheme="majorHAnsi" w:cstheme="majorBidi" w:ascii="宋体" w:hAnsi="宋体" w:eastAsia="宋体"/>
       <w:i/>
       <w:iCs/>
-      <w:color w:val="404040" w:themeColor="text1" w:themeTint="BF"/>
+      <w:color w:val="000000"/>
       <w:sz w:val="20"/>
       <w:szCs w:val="20"/>
     </w:rPr>
@@ -1125,6 +1384,8 @@
     <w:rsid w:val="00FC693F"/>
     <w:pPr>
       <w:spacing w:after="0" w:line="240" w:lineRule="auto"/>
+      <w:snapToGrid w:val="0"/>
+      <w:adjustRightInd w:val="0"/>
     </w:pPr>
   </w:style>
   <w:style w:type="character" w:customStyle="1" w:styleId="Heading1Char">
@@ -1179,15 +1440,21 @@
     <w:qFormat/>
     <w:rsid w:val="00FC693F"/>
     <w:pPr>
+      <w:spacing w:after="320" w:line="240" w:lineRule="auto" w:before="0"/>
+      <w:contextualSpacing/>
       <w:pBdr>
-        <w:bottom w:val="single" w:sz="8" w:space="4" w:color="4F81BD" w:themeColor="accent1"/>
+        <w:bottom w:val="none" w:sz="0" w:space="0" w:color="auto"/>
+        <w:top w:val="none" w:sz="0" w:space="0" w:color="auto"/>
+        <w:left w:val="none" w:sz="0" w:space="0" w:color="auto"/>
+        <w:right w:val="none" w:sz="0" w:space="0" w:color="auto"/>
       </w:pBdr>
-      <w:spacing w:after="300" w:line="240" w:lineRule="auto"/>
-      <w:contextualSpacing/>
+      <w:snapToGrid w:val="0"/>
+      <w:adjustRightInd w:val="0"/>
     </w:pPr>
     <w:rPr>
-      <w:rFonts w:asciiTheme="majorHAnsi" w:eastAsiaTheme="majorEastAsia" w:hAnsiTheme="majorHAnsi" w:cstheme="majorBidi"/>
-      <w:color w:val="17365D" w:themeColor="text2" w:themeShade="BF"/>
+      <w:rFonts w:asciiTheme="majorHAnsi" w:eastAsiaTheme="majorEastAsia" w:hAnsiTheme="majorHAnsi" w:cstheme="majorBidi" w:ascii="黑体" w:hAnsi="黑体" w:eastAsia="黑体"/>
+      <w:b/>
+      <w:color w:val="000000"/>
       <w:spacing w:val="5"/>
       <w:kern w:val="28"/>
       <w:sz w:val="52"/>
@@ -1221,6 +1488,8 @@
       <w:numPr>
         <w:ilvl w:val="1"/>
       </w:numPr>
+      <w:snapToGrid w:val="0"/>
+      <w:adjustRightInd w:val="0"/>
     </w:pPr>
     <w:rPr>
       <w:rFonts w:asciiTheme="majorHAnsi" w:eastAsiaTheme="majorEastAsia" w:hAnsiTheme="majorHAnsi" w:cstheme="majorBidi"/>
@@ -1255,9 +1524,17 @@
     <w:qFormat/>
     <w:rsid w:val="00FC693F"/>
     <w:pPr>
-      <w:ind w:left="720"/>
+      <w:spacing w:line="264" w:lineRule="auto" w:after="0" w:beforeLines="50"/>
+      <w:ind w:left="567" w:hanging="397"/>
       <w:contextualSpacing/>
-    </w:pPr>
+      <w:jc w:val="both"/>
+      <w:snapToGrid w:val="0"/>
+      <w:adjustRightInd w:val="0"/>
+    </w:pPr>
+    <w:rPr>
+      <w:rFonts w:ascii="仿宋_GB2312" w:hAnsi="仿宋_GB2312" w:eastAsia="仿宋_GB2312"/>
+      <w:sz w:val="24"/>
+    </w:rPr>
   </w:style>
   <w:style w:type="paragraph" w:styleId="BodyText">
     <w:name w:val="Body Text"/>
@@ -1267,7 +1544,11 @@
     <w:unhideWhenUsed/>
     <w:rsid w:val="00AA1D8D"/>
     <w:pPr>
-      <w:spacing w:after="120"/>
+      <w:spacing w:after="0" w:line="288" w:lineRule="auto" w:beforeLines="50"/>
+      <w:ind w:firstLine="480"/>
+      <w:jc w:val="both"/>
+      <w:snapToGrid w:val="0"/>
+      <w:adjustRightInd w:val="0"/>
     </w:pPr>
   </w:style>
   <w:style w:type="character" w:customStyle="1" w:styleId="BodyTextChar">
@@ -1286,6 +1567,8 @@
     <w:rsid w:val="00AA1D8D"/>
     <w:pPr>
       <w:spacing w:after="120" w:line="480" w:lineRule="auto"/>
+      <w:snapToGrid w:val="0"/>
+      <w:adjustRightInd w:val="0"/>
     </w:pPr>
   </w:style>
   <w:style w:type="character" w:customStyle="1" w:styleId="BodyText2Char">
@@ -1304,6 +1587,8 @@
     <w:rsid w:val="00AA1D8D"/>
     <w:pPr>
       <w:spacing w:after="120"/>
+      <w:snapToGrid w:val="0"/>
+      <w:adjustRightInd w:val="0"/>
     </w:pPr>
     <w:rPr>
       <w:sz w:val="16"/>
@@ -1330,6 +1615,8 @@
     <w:pPr>
       <w:ind w:left="360" w:hanging="360"/>
       <w:contextualSpacing/>
+      <w:snapToGrid w:val="0"/>
+      <w:adjustRightInd w:val="0"/>
     </w:pPr>
   </w:style>
   <w:style w:type="paragraph" w:styleId="List2">
@@ -1341,6 +1628,8 @@
     <w:pPr>
       <w:ind w:left="720" w:hanging="360"/>
       <w:contextualSpacing/>
+      <w:snapToGrid w:val="0"/>
+      <w:adjustRightInd w:val="0"/>
     </w:pPr>
   </w:style>
   <w:style w:type="paragraph" w:styleId="List3">
@@ -1352,6 +1641,8 @@
     <w:pPr>
       <w:ind w:left="1080" w:hanging="360"/>
       <w:contextualSpacing/>
+      <w:snapToGrid w:val="0"/>
+      <w:adjustRightInd w:val="0"/>
     </w:pPr>
   </w:style>
   <w:style w:type="paragraph" w:styleId="ListBullet">
@@ -1365,6 +1656,8 @@
         <w:numId w:val="1"/>
       </w:numPr>
       <w:contextualSpacing/>
+      <w:snapToGrid w:val="0"/>
+      <w:adjustRightInd w:val="0"/>
     </w:pPr>
   </w:style>
   <w:style w:type="paragraph" w:styleId="ListBullet2">
@@ -1378,6 +1671,8 @@
         <w:numId w:val="2"/>
       </w:numPr>
       <w:contextualSpacing/>
+      <w:snapToGrid w:val="0"/>
+      <w:adjustRightInd w:val="0"/>
     </w:pPr>
   </w:style>
   <w:style w:type="paragraph" w:styleId="ListBullet3">
@@ -1391,6 +1686,8 @@
         <w:numId w:val="3"/>
       </w:numPr>
       <w:contextualSpacing/>
+      <w:snapToGrid w:val="0"/>
+      <w:adjustRightInd w:val="0"/>
     </w:pPr>
   </w:style>
   <w:style w:type="paragraph" w:styleId="ListNumber">
@@ -1404,6 +1701,8 @@
         <w:numId w:val="5"/>
       </w:numPr>
       <w:contextualSpacing/>
+      <w:snapToGrid w:val="0"/>
+      <w:adjustRightInd w:val="0"/>
     </w:pPr>
   </w:style>
   <w:style w:type="paragraph" w:styleId="ListNumber2">
@@ -1417,6 +1716,8 @@
         <w:numId w:val="6"/>
       </w:numPr>
       <w:contextualSpacing/>
+      <w:snapToGrid w:val="0"/>
+      <w:adjustRightInd w:val="0"/>
     </w:pPr>
   </w:style>
   <w:style w:type="paragraph" w:styleId="ListNumber3">
@@ -1430,6 +1731,8 @@
         <w:numId w:val="7"/>
       </w:numPr>
       <w:contextualSpacing/>
+      <w:snapToGrid w:val="0"/>
+      <w:adjustRightInd w:val="0"/>
     </w:pPr>
   </w:style>
   <w:style w:type="paragraph" w:styleId="ListContinue">
@@ -1442,6 +1745,8 @@
       <w:spacing w:after="120"/>
       <w:ind w:left="360"/>
       <w:contextualSpacing/>
+      <w:snapToGrid w:val="0"/>
+      <w:adjustRightInd w:val="0"/>
     </w:pPr>
   </w:style>
   <w:style w:type="paragraph" w:styleId="ListContinue2">
@@ -1454,6 +1759,8 @@
       <w:spacing w:after="120"/>
       <w:ind w:left="720"/>
       <w:contextualSpacing/>
+      <w:snapToGrid w:val="0"/>
+      <w:adjustRightInd w:val="0"/>
     </w:pPr>
   </w:style>
   <w:style w:type="paragraph" w:styleId="ListContinue3">
@@ -1466,6 +1773,8 @@
       <w:spacing w:after="120"/>
       <w:ind w:left="1080"/>
       <w:contextualSpacing/>
+      <w:snapToGrid w:val="0"/>
+      <w:adjustRightInd w:val="0"/>
     </w:pPr>
   </w:style>
   <w:style w:type="paragraph" w:styleId="MacroText">
@@ -1484,6 +1793,8 @@
         <w:tab w:val="left" w:pos="3456"/>
         <w:tab w:val="left" w:pos="4032"/>
       </w:tabs>
+      <w:snapToGrid w:val="0"/>
+      <w:adjustRightInd w:val="0"/>
     </w:pPr>
     <w:rPr>
       <w:rFonts w:ascii="Courier" w:hAnsi="Courier"/>
@@ -1511,6 +1822,10 @@
     <w:uiPriority w:val="29"/>
     <w:qFormat/>
     <w:rsid w:val="00FC693F"/>
+    <w:pPr>
+      <w:snapToGrid w:val="0"/>
+      <w:adjustRightInd w:val="0"/>
+    </w:pPr>
     <w:rPr>
       <w:i/>
       <w:iCs/>
@@ -1626,6 +1941,8 @@
     <w:rsid w:val="00FC693F"/>
     <w:pPr>
       <w:spacing w:line="240" w:lineRule="auto"/>
+      <w:snapToGrid w:val="0"/>
+      <w:adjustRightInd w:val="0"/>
     </w:pPr>
     <w:rPr>
       <w:b/>
@@ -1671,6 +1988,8 @@
       </w:pBdr>
       <w:spacing w:before="200" w:after="280"/>
       <w:ind w:left="936" w:right="936"/>
+      <w:snapToGrid w:val="0"/>
+      <w:adjustRightInd w:val="0"/>
     </w:pPr>
     <w:rPr>
       <w:b/>
@@ -1771,6 +2090,8 @@
     <w:rsid w:val="00FC693F"/>
     <w:pPr>
       <w:outlineLvl w:val="9"/>
+      <w:snapToGrid w:val="0"/>
+      <w:adjustRightInd w:val="0"/>
     </w:pPr>
   </w:style>
   <w:style w:type="table" w:styleId="TableGrid">
@@ -12519,6 +12840,21 @@
         <w:shd w:val="clear" w:color="auto" w:fill="FBCAA2" w:themeFill="accent6" w:themeFillTint="7F"/>
       </w:tcPr>
     </w:tblStylePr>
+  </w:style>
+  <w:style w:type="paragraph" w:customStyle="1" w:styleId="ULParagraph">
+    <w:name w:val="UL Paragraph"/>
+    <w:basedOn w:val="Normal"/>
+    <w:pPr>
+      <w:spacing w:line="264" w:lineRule="auto" w:after="0" w:beforeLines="50"/>
+      <w:ind w:left="527" w:hanging="232"/>
+      <w:jc w:val="both"/>
+      <w:snapToGrid w:val="0"/>
+      <w:adjustRightInd w:val="0"/>
+    </w:pPr>
+    <w:rPr>
+      <w:rFonts w:ascii="仿宋_GB2312" w:hAnsi="仿宋_GB2312" w:eastAsia="仿宋_GB2312"/>
+      <w:sz w:val="24"/>
+    </w:rPr>
   </w:style>
 </w:styles>
 </file>

</xml_diff>